<commit_message>
Add unit test for UiApiServer and generate test reports
- Created a new test class `UiApiServerTest` to validate API behavior.
- Added test case `apiRequiresTokenAndReturnsInitialState` to check initial state response.
</commit_message>
<xml_diff>
--- a/GhostCoders_2026_SoftaBlitz_2026_updated.docx
+++ b/GhostCoders_2026_SoftaBlitz_2026_updated.docx
@@ -1105,11 +1105,11 @@
         <w:tblLook w:val="04A0" w:firstRow="1" w:lastRow="0" w:firstColumn="1" w:lastColumn="0" w:noHBand="0" w:noVBand="1"/>
       </w:tblPr>
       <w:tblGrid>
-        <w:gridCol w:w="1838"/>
-        <w:gridCol w:w="1066"/>
-        <w:gridCol w:w="1446"/>
-        <w:gridCol w:w="1570"/>
-        <w:gridCol w:w="3430"/>
+        <w:gridCol w:w="1848"/>
+        <w:gridCol w:w="1071"/>
+        <w:gridCol w:w="1391"/>
+        <w:gridCol w:w="1602"/>
+        <w:gridCol w:w="3438"/>
       </w:tblGrid>
       <w:tr>
         <w:tc>
@@ -1230,6 +1230,134 @@
             <w:hideMark/>
           </w:tcPr>
           <w:p>
+            <w:proofErr w:type="spellStart"/>
+            <w:r>
+              <w:rPr>
+                <w:rStyle w:val="Strong"/>
+              </w:rPr>
+              <w:t>JmDNS</w:t>
+            </w:r>
+            <w:proofErr w:type="spellEnd"/>
+          </w:p>
+        </w:tc>
+        <w:tc>
+          <w:tcPr>
+            <w:tcW w:w="0" w:type="auto"/>
+            <w:hideMark/>
+          </w:tcPr>
+          <w:p>
+            <w:r>
+              <w:t>Apache 2.0</w:t>
+            </w:r>
+          </w:p>
+        </w:tc>
+        <w:tc>
+          <w:tcPr>
+            <w:tcW w:w="0" w:type="auto"/>
+            <w:hideMark/>
+          </w:tcPr>
+          <w:p>
+            <w:r>
+              <w:t>Community (open source)</w:t>
+            </w:r>
+          </w:p>
+        </w:tc>
+        <w:tc>
+          <w:tcPr>
+            <w:tcW w:w="0" w:type="auto"/>
+            <w:hideMark/>
+          </w:tcPr>
+          <w:p>
+            <w:r>
+              <w:t>Raw UDP broadcast, SSDP/UPnP libraries, Bonjour SDK</w:t>
+            </w:r>
+          </w:p>
+        </w:tc>
+        <w:tc>
+          <w:tcPr>
+            <w:tcW w:w="0" w:type="auto"/>
+            <w:hideMark/>
+          </w:tcPr>
+          <w:p>
+            <w:r>
+              <w:t>Pure Java implementation of mDNS/DNS-SD, with no native install. It is the standard approach for LAN service discovery and works across Windows, macOS, and Linux. Less actively developed than larger libraries, which we offset by keeping the manual IP entry for networks that block mDNS.</w:t>
+            </w:r>
+          </w:p>
+        </w:tc>
+      </w:tr>
+      <w:tr>
+        <w:tc>
+          <w:tcPr>
+            <w:tcW w:w="0" w:type="auto"/>
+            <w:hideMark/>
+          </w:tcPr>
+          <w:p>
+            <w:r>
+              <w:rPr>
+                <w:rStyle w:val="Strong"/>
+              </w:rPr>
+              <w:t>Jackson</w:t>
+            </w:r>
+          </w:p>
+        </w:tc>
+        <w:tc>
+          <w:tcPr>
+            <w:tcW w:w="0" w:type="auto"/>
+            <w:hideMark/>
+          </w:tcPr>
+          <w:p>
+            <w:r>
+              <w:t>Apache 2.0</w:t>
+            </w:r>
+          </w:p>
+        </w:tc>
+        <w:tc>
+          <w:tcPr>
+            <w:tcW w:w="0" w:type="auto"/>
+            <w:hideMark/>
+          </w:tcPr>
+          <w:p>
+            <w:r>
+              <w:t>FasterXML (company-backed)</w:t>
+            </w:r>
+          </w:p>
+        </w:tc>
+        <w:tc>
+          <w:tcPr>
+            <w:tcW w:w="0" w:type="auto"/>
+            <w:hideMark/>
+          </w:tcPr>
+          <w:p>
+            <w:r>
+              <w:t>Gson</w:t>
+            </w:r>
+          </w:p>
+        </w:tc>
+        <w:tc>
+          <w:tcPr>
+            <w:tcW w:w="0" w:type="auto"/>
+            <w:hideMark/>
+          </w:tcPr>
+          <w:p>
+            <w:r>
+              <w:t>Used for the transfer metadata and the history file. It handles Java records cleanly, and timestamps are stored as ISO strings, so no extra date module or dependency is needed.</w:t>
+            </w:r>
+          </w:p>
+        </w:tc>
+      </w:tr>
+      <w:tr>
+        <w:tc>
+          <w:tcPr>
+            <w:tcW w:w="0" w:type="auto"/>
+            <w:hideMark/>
+          </w:tcPr>
+          <w:p>
+            <w:r>
+              <w:rPr>
+                <w:rStyle w:val="Strong"/>
+              </w:rPr>
+              <w:t xml:space="preserve">Java </w:t>
+            </w:r>
             <w:r>
               <w:rPr>
                 <w:rStyle w:val="HTMLCode"/>
@@ -1237,54 +1365,54 @@
                 <w:b/>
                 <w:bCs/>
               </w:rPr>
-              <w:t>JavaFX</w:t>
-            </w:r>
-            <w:r>
-              <w:t xml:space="preserve"> (controls, fxml)</w:t>
-            </w:r>
-          </w:p>
-        </w:tc>
-        <w:tc>
-          <w:tcPr>
-            <w:tcW w:w="0" w:type="auto"/>
-            <w:hideMark/>
-          </w:tcPr>
-          <w:p>
-            <w:r>
-              <w:t>GPL v2 + CPE</w:t>
-            </w:r>
-          </w:p>
-        </w:tc>
-        <w:tc>
-          <w:tcPr>
-            <w:tcW w:w="0" w:type="auto"/>
-            <w:hideMark/>
-          </w:tcPr>
-          <w:p>
-            <w:r>
-              <w:t>OpenJFX project (open source, Gluon-led)</w:t>
-            </w:r>
-          </w:p>
-        </w:tc>
-        <w:tc>
-          <w:tcPr>
-            <w:tcW w:w="0" w:type="auto"/>
-            <w:hideMark/>
-          </w:tcPr>
-          <w:p>
-            <w:r>
-              <w:t>Swing, SWT, browser UI on Spring Boot</w:t>
-            </w:r>
-          </w:p>
-        </w:tc>
-        <w:tc>
-          <w:tcPr>
-            <w:tcW w:w="0" w:type="auto"/>
-            <w:hideMark/>
-          </w:tcPr>
-          <w:p>
-            <w:r>
-              <w:t>Native desktop UI with FXML views and controllers. ObservableList and property binding keep the device list and progress bars in sync. FileChooser, DirectoryChooser and drag and drop return real file paths, so files are read in place with no upload or staging copy. No web framework or browser is needed.</w:t>
+              <w:t>HttpClient</w:t>
+            </w:r>
+            <w:r>
+              <w:t xml:space="preserve"> (JDK 11+)</w:t>
+            </w:r>
+          </w:p>
+        </w:tc>
+        <w:tc>
+          <w:tcPr>
+            <w:tcW w:w="0" w:type="auto"/>
+            <w:hideMark/>
+          </w:tcPr>
+          <w:p>
+            <w:r>
+              <w:t>OpenJDK license</w:t>
+            </w:r>
+          </w:p>
+        </w:tc>
+        <w:tc>
+          <w:tcPr>
+            <w:tcW w:w="0" w:type="auto"/>
+            <w:hideMark/>
+          </w:tcPr>
+          <w:p>
+            <w:r>
+              <w:t>OpenJDK</w:t>
+            </w:r>
+          </w:p>
+        </w:tc>
+        <w:tc>
+          <w:tcPr>
+            <w:tcW w:w="0" w:type="auto"/>
+            <w:hideMark/>
+          </w:tcPr>
+          <w:p>
+            <w:r>
+              <w:t>Apache HttpClient, OkHttp</w:t>
+            </w:r>
+          </w:p>
+        </w:tc>
+        <w:tc>
+          <w:tcPr>
+            <w:tcW w:w="0" w:type="auto"/>
+            <w:hideMark/>
+          </w:tcPr>
+          <w:p>
+            <w:r>
+              <w:t>Built in, supports streaming request bodies and timeouts, and adds no dependency to maintain.</w:t>
             </w:r>
           </w:p>
         </w:tc>
@@ -1296,133 +1424,6 @@
             <w:hideMark/>
           </w:tcPr>
           <w:p>
-            <w:r>
-              <w:rPr>
-                <w:rStyle w:val="Strong"/>
-              </w:rPr>
-              <w:t>JmDNS</w:t>
-            </w:r>
-          </w:p>
-        </w:tc>
-        <w:tc>
-          <w:tcPr>
-            <w:tcW w:w="0" w:type="auto"/>
-            <w:hideMark/>
-          </w:tcPr>
-          <w:p>
-            <w:r>
-              <w:t>Apache 2.0</w:t>
-            </w:r>
-          </w:p>
-        </w:tc>
-        <w:tc>
-          <w:tcPr>
-            <w:tcW w:w="0" w:type="auto"/>
-            <w:hideMark/>
-          </w:tcPr>
-          <w:p>
-            <w:r>
-              <w:t>Community (open source)</w:t>
-            </w:r>
-          </w:p>
-        </w:tc>
-        <w:tc>
-          <w:tcPr>
-            <w:tcW w:w="0" w:type="auto"/>
-            <w:hideMark/>
-          </w:tcPr>
-          <w:p>
-            <w:r>
-              <w:t>Raw UDP broadcast, SSDP/UPnP libraries, Bonjour SDK</w:t>
-            </w:r>
-          </w:p>
-        </w:tc>
-        <w:tc>
-          <w:tcPr>
-            <w:tcW w:w="0" w:type="auto"/>
-            <w:hideMark/>
-          </w:tcPr>
-          <w:p>
-            <w:r>
-              <w:t>Pure Java implementation of mDNS/DNS-SD, with no native install. It is the standard approach for LAN service discovery and works across Windows, macOS, and Linux. Less actively developed than larger libraries, which we offset by keeping the manual IP entry for networks that block mDNS.</w:t>
-            </w:r>
-          </w:p>
-        </w:tc>
-      </w:tr>
-      <w:tr>
-        <w:tc>
-          <w:tcPr>
-            <w:tcW w:w="0" w:type="auto"/>
-            <w:hideMark/>
-          </w:tcPr>
-          <w:p>
-            <w:r>
-              <w:rPr>
-                <w:rStyle w:val="Strong"/>
-              </w:rPr>
-              <w:t>Jackson</w:t>
-            </w:r>
-          </w:p>
-        </w:tc>
-        <w:tc>
-          <w:tcPr>
-            <w:tcW w:w="0" w:type="auto"/>
-            <w:hideMark/>
-          </w:tcPr>
-          <w:p>
-            <w:r>
-              <w:t>Apache 2.0</w:t>
-            </w:r>
-          </w:p>
-        </w:tc>
-        <w:tc>
-          <w:tcPr>
-            <w:tcW w:w="0" w:type="auto"/>
-            <w:hideMark/>
-          </w:tcPr>
-          <w:p>
-            <w:r>
-              <w:t>FasterXML (company-backed)</w:t>
-            </w:r>
-          </w:p>
-        </w:tc>
-        <w:tc>
-          <w:tcPr>
-            <w:tcW w:w="0" w:type="auto"/>
-            <w:hideMark/>
-          </w:tcPr>
-          <w:p>
-            <w:r>
-              <w:t>Gson</w:t>
-            </w:r>
-          </w:p>
-        </w:tc>
-        <w:tc>
-          <w:tcPr>
-            <w:tcW w:w="0" w:type="auto"/>
-            <w:hideMark/>
-          </w:tcPr>
-          <w:p>
-            <w:r>
-              <w:t>Used for the transfer metadata and the history file. It handles Java records cleanly, and timestamps are stored as ISO strings, so no extra date module or dependency is needed.</w:t>
-            </w:r>
-          </w:p>
-        </w:tc>
-      </w:tr>
-      <w:tr>
-        <w:tc>
-          <w:tcPr>
-            <w:tcW w:w="0" w:type="auto"/>
-            <w:hideMark/>
-          </w:tcPr>
-          <w:p>
-            <w:r>
-              <w:rPr>
-                <w:rStyle w:val="Strong"/>
-              </w:rPr>
-              <w:lastRenderedPageBreak/>
-              <w:t xml:space="preserve">Java </w:t>
-            </w:r>
             <w:r>
               <w:rPr>
                 <w:rStyle w:val="HTMLCode"/>
@@ -1430,10 +1431,10 @@
                 <w:b/>
                 <w:bCs/>
               </w:rPr>
-              <w:t>HttpClient</w:t>
-            </w:r>
-            <w:r>
-              <w:t xml:space="preserve"> (JDK 11+)</w:t>
+              <w:t>MessageDigest</w:t>
+            </w:r>
+            <w:r>
+              <w:t xml:space="preserve"> (JDK)</w:t>
             </w:r>
           </w:p>
         </w:tc>
@@ -1466,18 +1467,18 @@
           </w:tcPr>
           <w:p>
             <w:r>
-              <w:t>Apache HttpClient, OkHttp</w:t>
-            </w:r>
-          </w:p>
-        </w:tc>
-        <w:tc>
-          <w:tcPr>
-            <w:tcW w:w="0" w:type="auto"/>
-            <w:hideMark/>
-          </w:tcPr>
-          <w:p>
-            <w:r>
-              <w:t>Built in, supports streaming request bodies and timeouts, and adds no dependency to maintain.</w:t>
+              <w:t>Guava, Commons Codec</w:t>
+            </w:r>
+          </w:p>
+        </w:tc>
+        <w:tc>
+          <w:tcPr>
+            <w:tcW w:w="0" w:type="auto"/>
+            <w:hideMark/>
+          </w:tcPr>
+          <w:p>
+            <w:r>
+              <w:t>SHA-256 is part of the standard library, so no extra library is needed.</w:t>
             </w:r>
           </w:p>
         </w:tc>
@@ -1496,7 +1497,8 @@
                 <w:b/>
                 <w:bCs/>
               </w:rPr>
-              <w:t>MessageDigest</w:t>
+              <w:lastRenderedPageBreak/>
+              <w:t>JDK HttpServer</w:t>
             </w:r>
             <w:r>
               <w:t xml:space="preserve"> (JDK)</w:t>
@@ -1532,18 +1534,18 @@
           </w:tcPr>
           <w:p>
             <w:r>
-              <w:t>Guava, Commons Codec</w:t>
-            </w:r>
-          </w:p>
-        </w:tc>
-        <w:tc>
-          <w:tcPr>
-            <w:tcW w:w="0" w:type="auto"/>
-            <w:hideMark/>
-          </w:tcPr>
-          <w:p>
-            <w:r>
-              <w:t>SHA-256 is part of the standard library, so no extra library is needed.</w:t>
+              <w:t>Spring Boot (Tomcat), Javalin, Quarkus</w:t>
+            </w:r>
+          </w:p>
+        </w:tc>
+        <w:tc>
+          <w:tcPr>
+            <w:tcW w:w="0" w:type="auto"/>
+            <w:hideMark/>
+          </w:tcPr>
+          <w:p>
+            <w:r>
+              <w:t>Built in, supports streaming request and response bodies, and needs no dependency. It serves only the four /peer/** endpoints, because the UI is not served over HTTP. Runs one lightweight virtual thread per request, so a held-open consent request never blocks others.</w:t>
             </w:r>
           </w:p>
         </w:tc>
@@ -1562,54 +1564,51 @@
                 <w:b/>
                 <w:bCs/>
               </w:rPr>
-              <w:t>JDK HttpServer</w:t>
-            </w:r>
-            <w:r>
-              <w:t xml:space="preserve"> (JDK)</w:t>
-            </w:r>
-          </w:p>
-        </w:tc>
-        <w:tc>
-          <w:tcPr>
-            <w:tcW w:w="0" w:type="auto"/>
-            <w:hideMark/>
-          </w:tcPr>
-          <w:p>
-            <w:r>
-              <w:t>OpenJDK license</w:t>
-            </w:r>
-          </w:p>
-        </w:tc>
-        <w:tc>
-          <w:tcPr>
-            <w:tcW w:w="0" w:type="auto"/>
-            <w:hideMark/>
-          </w:tcPr>
-          <w:p>
-            <w:r>
-              <w:t>OpenJDK</w:t>
-            </w:r>
-          </w:p>
-        </w:tc>
-        <w:tc>
-          <w:tcPr>
-            <w:tcW w:w="0" w:type="auto"/>
-            <w:hideMark/>
-          </w:tcPr>
-          <w:p>
-            <w:r>
-              <w:t>Spring Boot (Tomcat), Javalin, Quarkus</w:t>
-            </w:r>
-          </w:p>
-        </w:tc>
-        <w:tc>
-          <w:tcPr>
-            <w:tcW w:w="0" w:type="auto"/>
-            <w:hideMark/>
-          </w:tcPr>
-          <w:p>
-            <w:r>
-              <w:t>Built in, supports streaming request and response bodies, and needs no dependency. It serves only the four /peer/** endpoints, because the UI is not served over HTTP. Runs one lightweight virtual thread per request, so a held-open consent request never blocks others.</w:t>
+              <w:t>JUnit 5</w:t>
+            </w:r>
+          </w:p>
+        </w:tc>
+        <w:tc>
+          <w:tcPr>
+            <w:tcW w:w="0" w:type="auto"/>
+            <w:hideMark/>
+          </w:tcPr>
+          <w:p>
+            <w:r>
+              <w:t>EPL 2.0</w:t>
+            </w:r>
+          </w:p>
+        </w:tc>
+        <w:tc>
+          <w:tcPr>
+            <w:tcW w:w="0" w:type="auto"/>
+            <w:hideMark/>
+          </w:tcPr>
+          <w:p>
+            <w:r>
+              <w:t>JUnit team</w:t>
+            </w:r>
+          </w:p>
+        </w:tc>
+        <w:tc>
+          <w:tcPr>
+            <w:tcW w:w="0" w:type="auto"/>
+            <w:hideMark/>
+          </w:tcPr>
+          <w:p>
+            <w:r>
+              <w:t>TestNG</w:t>
+            </w:r>
+          </w:p>
+        </w:tc>
+        <w:tc>
+          <w:tcPr>
+            <w:tcW w:w="0" w:type="auto"/>
+            <w:hideMark/>
+          </w:tcPr>
+          <w:p>
+            <w:r>
+              <w:t>The standard Java test framework, with first-class Maven Surefire support. Used for checksum, file name sanitizing and progress tests.</w:t>
             </w:r>
           </w:p>
         </w:tc>
@@ -1618,62 +1617,92 @@
         <w:tc>
           <w:tcPr>
             <w:tcW w:w="0" w:type="auto"/>
-            <w:hideMark/>
-          </w:tcPr>
-          <w:p>
-            <w:r>
+          </w:tcPr>
+          <w:p>
+            <w:pPr>
               <w:rPr>
                 <w:rStyle w:val="HTMLCode"/>
                 <w:rFonts w:eastAsia="Calibri"/>
                 <w:b/>
                 <w:bCs/>
               </w:rPr>
-              <w:t>JUnit 5</w:t>
-            </w:r>
-          </w:p>
-        </w:tc>
-        <w:tc>
-          <w:tcPr>
-            <w:tcW w:w="0" w:type="auto"/>
-            <w:hideMark/>
-          </w:tcPr>
-          <w:p>
-            <w:r>
-              <w:t>EPL 2.0</w:t>
-            </w:r>
-          </w:p>
-        </w:tc>
-        <w:tc>
-          <w:tcPr>
-            <w:tcW w:w="0" w:type="auto"/>
-            <w:hideMark/>
-          </w:tcPr>
-          <w:p>
-            <w:r>
-              <w:t>JUnit team</w:t>
-            </w:r>
-          </w:p>
-        </w:tc>
-        <w:tc>
-          <w:tcPr>
-            <w:tcW w:w="0" w:type="auto"/>
-            <w:hideMark/>
-          </w:tcPr>
-          <w:p>
-            <w:r>
-              <w:t>TestNG</w:t>
-            </w:r>
-          </w:p>
-        </w:tc>
-        <w:tc>
-          <w:tcPr>
-            <w:tcW w:w="0" w:type="auto"/>
-            <w:hideMark/>
-          </w:tcPr>
-          <w:p>
-            <w:r>
-              <w:t>The standard Java test framework, with first-class Maven Surefire support. Used for checksum, file name sanitizing and progress tests.</w:t>
-            </w:r>
+            </w:pPr>
+            <w:r>
+              <w:rPr>
+                <w:rStyle w:val="HTMLCode"/>
+                <w:rFonts w:eastAsia="Calibri"/>
+                <w:b/>
+                <w:bCs/>
+              </w:rPr>
+              <w:t>Electron</w:t>
+            </w:r>
+          </w:p>
+        </w:tc>
+        <w:tc>
+          <w:tcPr>
+            <w:tcW w:w="0" w:type="auto"/>
+          </w:tcPr>
+          <w:p>
+            <w:r>
+              <w:t>MIT License</w:t>
+            </w:r>
+          </w:p>
+        </w:tc>
+        <w:tc>
+          <w:tcPr>
+            <w:tcW w:w="0" w:type="auto"/>
+          </w:tcPr>
+          <w:p>
+            <w:r>
+              <w:t>Community (Open Source)</w:t>
+            </w:r>
+          </w:p>
+        </w:tc>
+        <w:tc>
+          <w:tcPr>
+            <w:tcW w:w="0" w:type="auto"/>
+          </w:tcPr>
+          <w:p>
+            <w:proofErr w:type="spellStart"/>
+            <w:r>
+              <w:t>Tauri</w:t>
+            </w:r>
+            <w:proofErr w:type="spellEnd"/>
+          </w:p>
+        </w:tc>
+        <w:tc>
+          <w:tcPr>
+            <w:tcW w:w="0" w:type="auto"/>
+          </w:tcPr>
+          <w:p>
+            <w:pPr>
+              <w:rPr>
+                <w:sz w:val="21"/>
+                <w:szCs w:val="21"/>
+              </w:rPr>
+            </w:pPr>
+            <w:proofErr w:type="spellStart"/>
+            <w:r>
+              <w:rPr>
+                <w:rFonts w:ascii="Arial" w:hAnsi="Arial" w:cs="Arial"/>
+                <w:sz w:val="21"/>
+                <w:szCs w:val="21"/>
+              </w:rPr>
+              <w:t>Lets</w:t>
+            </w:r>
+            <w:proofErr w:type="spellEnd"/>
+            <w:r>
+              <w:rPr>
+                <w:rFonts w:ascii="Arial" w:hAnsi="Arial" w:cs="Arial"/>
+                <w:sz w:val="21"/>
+                <w:szCs w:val="21"/>
+              </w:rPr>
+              <w:t xml:space="preserve"> you leverage the massive global web developer ecosystem and pre-built UI components.</w:t>
+            </w:r>
+          </w:p>
+          <w:p>
+            <w:bookmarkStart w:id="9" w:name="_GoBack"/>
+            <w:bookmarkEnd w:id="9"/>
           </w:p>
         </w:tc>
       </w:tr>
@@ -1691,8 +1720,8 @@
           <w:szCs w:val="32"/>
         </w:rPr>
       </w:pPr>
-      <w:bookmarkStart w:id="9" w:name="_veadhtsf32nc" w:colFirst="0" w:colLast="0"/>
-      <w:bookmarkEnd w:id="9"/>
+      <w:bookmarkStart w:id="10" w:name="_veadhtsf32nc" w:colFirst="0" w:colLast="0"/>
+      <w:bookmarkEnd w:id="10"/>
     </w:p>
     <w:p>
       <w:r>
@@ -1733,9 +1762,8 @@
           <w:szCs w:val="32"/>
         </w:rPr>
       </w:pPr>
-      <w:bookmarkStart w:id="10" w:name="_17dp8vu" w:colFirst="0" w:colLast="0"/>
-      <w:bookmarkStart w:id="11" w:name="_GoBack"/>
-      <w:bookmarkEnd w:id="10"/>
+      <w:bookmarkStart w:id="11" w:name="_17dp8vu" w:colFirst="0" w:colLast="0"/>
+      <w:bookmarkEnd w:id="11"/>
       <w:r>
         <w:rPr>
           <w:rFonts w:ascii="Cambria" w:eastAsia="Cambria" w:hAnsi="Cambria" w:cs="Cambria"/>
@@ -1787,7 +1815,6 @@
           </wp:inline>
         </w:drawing>
       </w:r>
-      <w:bookmarkEnd w:id="11"/>
     </w:p>
     <w:p>
       <w:pPr>

</xml_diff>